<commit_message>
Improve guide theme and gap analysis
</commit_message>
<xml_diff>
--- a/outputs/guide_review_pack/03_theme_and_gap_analysis.docx
+++ b/outputs/guide_review_pack/03_theme_and_gap_analysis.docx
@@ -45,7 +45,20 @@
         <w:pStyle w:val="Heading1"/>
       </w:pPr>
       <w:r>
-        <w:t>Main Theme Groups</w:t>
+        <w:t>Theme Classification Logic</w:t>
+      </w:r>
+    </w:p>
+    <w:p>
+      <w:r>
+        <w:t>The review was organized as: paper-wise extraction, theme grouping, repeated-gap analysis, research opportunity identification, and then candidate topic development. The final title should emerge from repeated gaps and dataset feasibility, not from a single attractive keyword.</w:t>
+      </w:r>
+    </w:p>
+    <w:p>
+      <w:pPr>
+        <w:pStyle w:val="Heading1"/>
+      </w:pPr>
+      <w:r>
+        <w:t>Major Theme Groups</w:t>
       </w:r>
     </w:p>
     <w:tbl>
@@ -56,14 +69,15 @@
         <w:tblLook w:firstColumn="1" w:firstRow="1" w:lastColumn="0" w:lastRow="0" w:noHBand="0" w:noVBand="1" w:val="04A0"/>
       </w:tblPr>
       <w:tblGrid>
-        <w:gridCol w:w="3120"/>
-        <w:gridCol w:w="3120"/>
-        <w:gridCol w:w="3120"/>
+        <w:gridCol w:w="2340"/>
+        <w:gridCol w:w="2340"/>
+        <w:gridCol w:w="2340"/>
+        <w:gridCol w:w="2340"/>
       </w:tblGrid>
       <w:tr>
         <w:tc>
           <w:tcPr>
-            <w:tcW w:type="dxa" w:w="2232"/>
+            <w:tcW w:type="dxa" w:w="1944"/>
             <w:shd w:fill="F2F4F7"/>
             <w:vAlign w:val="center"/>
           </w:tcPr>
@@ -78,13 +92,13 @@
                 <w:b/>
                 <w:sz w:val="18"/>
               </w:rPr>
-              <w:t>Theme Group</w:t>
+              <w:t>Major Theme</w:t>
             </w:r>
           </w:p>
         </w:tc>
         <w:tc>
           <w:tcPr>
-            <w:tcW w:type="dxa" w:w="2088"/>
+            <w:tcW w:type="dxa" w:w="1584"/>
             <w:shd w:fill="F2F4F7"/>
             <w:vAlign w:val="center"/>
           </w:tcPr>
@@ -105,7 +119,7 @@
         </w:tc>
         <w:tc>
           <w:tcPr>
-            <w:tcW w:type="dxa" w:w="4824"/>
+            <w:tcW w:type="dxa" w:w="3672"/>
             <w:shd w:fill="F2F4F7"/>
             <w:vAlign w:val="center"/>
           </w:tcPr>
@@ -120,7 +134,28 @@
                 <w:b/>
                 <w:sz w:val="18"/>
               </w:rPr>
-              <w:t>Interpretation</w:t>
+              <w:t>How It Helps Topic Selection</w:t>
+            </w:r>
+          </w:p>
+        </w:tc>
+        <w:tc>
+          <w:tcPr>
+            <w:tcW w:type="dxa" w:w="1944"/>
+            <w:shd w:fill="F2F4F7"/>
+            <w:vAlign w:val="center"/>
+          </w:tcPr>
+          <w:p>
+            <w:pPr>
+              <w:spacing w:after="0"/>
+            </w:pPr>
+            <w:r/>
+            <w:r>
+              <w:rPr>
+                <w:rFonts w:ascii="Calibri" w:hAnsi="Calibri"/>
+                <w:b/>
+                <w:sz w:val="18"/>
+              </w:rPr>
+              <w:t>Dataset Dependency</w:t>
             </w:r>
           </w:p>
         </w:tc>
@@ -128,7 +163,7 @@
       <w:tr>
         <w:tc>
           <w:tcPr>
-            <w:tcW w:type="dxa" w:w="2232"/>
+            <w:tcW w:type="dxa" w:w="1944"/>
             <w:vAlign w:val="center"/>
           </w:tcPr>
           <w:p>
@@ -148,7 +183,7 @@
         </w:tc>
         <w:tc>
           <w:tcPr>
-            <w:tcW w:type="dxa" w:w="2088"/>
+            <w:tcW w:type="dxa" w:w="1584"/>
             <w:vAlign w:val="center"/>
           </w:tcPr>
           <w:p>
@@ -168,7 +203,7 @@
         </w:tc>
         <w:tc>
           <w:tcPr>
-            <w:tcW w:type="dxa" w:w="4824"/>
+            <w:tcW w:type="dxa" w:w="3672"/>
             <w:vAlign w:val="center"/>
           </w:tcPr>
           <w:p>
@@ -182,7 +217,27 @@
                 <w:b w:val="0"/>
                 <w:sz w:val="18"/>
               </w:rPr>
-              <w:t>Core predictive analytics direction.</w:t>
+              <w:t>Provides the core predictive analytics direction: clinical pregnancy, live birth, miscarriage or related IVF outcome.</w:t>
+            </w:r>
+          </w:p>
+        </w:tc>
+        <w:tc>
+          <w:tcPr>
+            <w:tcW w:type="dxa" w:w="1944"/>
+            <w:vAlign w:val="center"/>
+          </w:tcPr>
+          <w:p>
+            <w:pPr>
+              <w:spacing w:after="0"/>
+            </w:pPr>
+            <w:r/>
+            <w:r>
+              <w:rPr>
+                <w:rFonts w:ascii="Calibri" w:hAnsi="Calibri"/>
+                <w:b w:val="0"/>
+                <w:sz w:val="18"/>
+              </w:rPr>
+              <w:t>Needs a clear outcome variable; live birth is strongest but may be harder to collect.</w:t>
             </w:r>
           </w:p>
         </w:tc>
@@ -190,7 +245,7 @@
       <w:tr>
         <w:tc>
           <w:tcPr>
-            <w:tcW w:type="dxa" w:w="2232"/>
+            <w:tcW w:type="dxa" w:w="1944"/>
             <w:vAlign w:val="center"/>
           </w:tcPr>
           <w:p>
@@ -210,7 +265,7 @@
         </w:tc>
         <w:tc>
           <w:tcPr>
-            <w:tcW w:type="dxa" w:w="2088"/>
+            <w:tcW w:type="dxa" w:w="1584"/>
             <w:vAlign w:val="center"/>
           </w:tcPr>
           <w:p>
@@ -230,7 +285,7 @@
         </w:tc>
         <w:tc>
           <w:tcPr>
-            <w:tcW w:type="dxa" w:w="4824"/>
+            <w:tcW w:type="dxa" w:w="3672"/>
             <w:vAlign w:val="center"/>
           </w:tcPr>
           <w:p>
@@ -244,7 +299,27 @@
                 <w:b w:val="0"/>
                 <w:sz w:val="18"/>
               </w:rPr>
-              <w:t>Needed for transparent clinical use.</w:t>
+              <w:t>Supports moving beyond black-box prediction toward interpretable, patient-level and clinician-facing explanations.</w:t>
+            </w:r>
+          </w:p>
+        </w:tc>
+        <w:tc>
+          <w:tcPr>
+            <w:tcW w:type="dxa" w:w="1944"/>
+            <w:vAlign w:val="center"/>
+          </w:tcPr>
+          <w:p>
+            <w:pPr>
+              <w:spacing w:after="0"/>
+            </w:pPr>
+            <w:r/>
+            <w:r>
+              <w:rPr>
+                <w:rFonts w:ascii="Calibri" w:hAnsi="Calibri"/>
+                <w:b w:val="0"/>
+                <w:sz w:val="18"/>
+              </w:rPr>
+              <w:t>Needs model outputs that can be explained; clinician review is ideal.</w:t>
             </w:r>
           </w:p>
         </w:tc>
@@ -252,7 +327,7 @@
       <w:tr>
         <w:tc>
           <w:tcPr>
-            <w:tcW w:type="dxa" w:w="2232"/>
+            <w:tcW w:type="dxa" w:w="1944"/>
             <w:vAlign w:val="center"/>
           </w:tcPr>
           <w:p>
@@ -272,7 +347,7 @@
         </w:tc>
         <w:tc>
           <w:tcPr>
-            <w:tcW w:type="dxa" w:w="2088"/>
+            <w:tcW w:type="dxa" w:w="1584"/>
             <w:vAlign w:val="center"/>
           </w:tcPr>
           <w:p>
@@ -292,7 +367,7 @@
         </w:tc>
         <w:tc>
           <w:tcPr>
-            <w:tcW w:type="dxa" w:w="4824"/>
+            <w:tcW w:type="dxa" w:w="3672"/>
             <w:vAlign w:val="center"/>
           </w:tcPr>
           <w:p>
@@ -306,7 +381,27 @@
                 <w:b w:val="0"/>
                 <w:sz w:val="18"/>
               </w:rPr>
-              <w:t>Moves work beyond accuracy-only model building.</w:t>
+              <w:t>Positions the PhD as a usable framework, not only an accuracy comparison study.</w:t>
+            </w:r>
+          </w:p>
+        </w:tc>
+        <w:tc>
+          <w:tcPr>
+            <w:tcW w:type="dxa" w:w="1944"/>
+            <w:vAlign w:val="center"/>
+          </w:tcPr>
+          <w:p>
+            <w:pPr>
+              <w:spacing w:after="0"/>
+            </w:pPr>
+            <w:r/>
+            <w:r>
+              <w:rPr>
+                <w:rFonts w:ascii="Calibri" w:hAnsi="Calibri"/>
+                <w:b w:val="0"/>
+                <w:sz w:val="18"/>
+              </w:rPr>
+              <w:t>Needs careful framing: support clinical counseling or planning, not replace doctors.</w:t>
             </w:r>
           </w:p>
         </w:tc>
@@ -314,7 +409,7 @@
       <w:tr>
         <w:tc>
           <w:tcPr>
-            <w:tcW w:type="dxa" w:w="2232"/>
+            <w:tcW w:type="dxa" w:w="1944"/>
             <w:vAlign w:val="center"/>
           </w:tcPr>
           <w:p>
@@ -334,7 +429,7 @@
         </w:tc>
         <w:tc>
           <w:tcPr>
-            <w:tcW w:type="dxa" w:w="2088"/>
+            <w:tcW w:type="dxa" w:w="1584"/>
             <w:vAlign w:val="center"/>
           </w:tcPr>
           <w:p>
@@ -354,7 +449,7 @@
         </w:tc>
         <w:tc>
           <w:tcPr>
-            <w:tcW w:type="dxa" w:w="4824"/>
+            <w:tcW w:type="dxa" w:w="3672"/>
             <w:vAlign w:val="center"/>
           </w:tcPr>
           <w:p>
@@ -368,7 +463,136 @@
                 <w:b w:val="0"/>
                 <w:sz w:val="18"/>
               </w:rPr>
-              <w:t>Supports patient-specific or protocol-specific modeling.</w:t>
+              <w:t>Supports patient-specific prediction and treatment-context interpretation.</w:t>
+            </w:r>
+          </w:p>
+        </w:tc>
+        <w:tc>
+          <w:tcPr>
+            <w:tcW w:type="dxa" w:w="1944"/>
+            <w:vAlign w:val="center"/>
+          </w:tcPr>
+          <w:p>
+            <w:pPr>
+              <w:spacing w:after="0"/>
+            </w:pPr>
+            <w:r/>
+            <w:r>
+              <w:rPr>
+                <w:rFonts w:ascii="Calibri" w:hAnsi="Calibri"/>
+                <w:b w:val="0"/>
+                <w:sz w:val="18"/>
+              </w:rPr>
+              <w:t>Needs enough patient-level variables and subgroup size.</w:t>
+            </w:r>
+          </w:p>
+        </w:tc>
+      </w:tr>
+    </w:tbl>
+    <w:p/>
+    <w:p>
+      <w:pPr>
+        <w:pStyle w:val="Heading1"/>
+      </w:pPr>
+      <w:r>
+        <w:t>Supporting Themes</w:t>
+      </w:r>
+    </w:p>
+    <w:tbl>
+      <w:tblPr>
+        <w:tblStyle w:val="TableGrid"/>
+        <w:tblW w:type="auto" w:w="0"/>
+        <w:jc w:val="center"/>
+        <w:tblLook w:firstColumn="1" w:firstRow="1" w:lastColumn="0" w:lastRow="0" w:noHBand="0" w:noVBand="1" w:val="04A0"/>
+      </w:tblPr>
+      <w:tblGrid>
+        <w:gridCol w:w="2340"/>
+        <w:gridCol w:w="2340"/>
+        <w:gridCol w:w="2340"/>
+        <w:gridCol w:w="2340"/>
+      </w:tblGrid>
+      <w:tr>
+        <w:tc>
+          <w:tcPr>
+            <w:tcW w:type="dxa" w:w="2088"/>
+            <w:shd w:fill="F2F4F7"/>
+            <w:vAlign w:val="center"/>
+          </w:tcPr>
+          <w:p>
+            <w:pPr>
+              <w:spacing w:after="0"/>
+            </w:pPr>
+            <w:r/>
+            <w:r>
+              <w:rPr>
+                <w:rFonts w:ascii="Calibri" w:hAnsi="Calibri"/>
+                <w:b/>
+                <w:sz w:val="18"/>
+              </w:rPr>
+              <w:t>Supporting Theme</w:t>
+            </w:r>
+          </w:p>
+        </w:tc>
+        <w:tc>
+          <w:tcPr>
+            <w:tcW w:type="dxa" w:w="1656"/>
+            <w:shd w:fill="F2F4F7"/>
+            <w:vAlign w:val="center"/>
+          </w:tcPr>
+          <w:p>
+            <w:pPr>
+              <w:spacing w:after="0"/>
+            </w:pPr>
+            <w:r/>
+            <w:r>
+              <w:rPr>
+                <w:rFonts w:ascii="Calibri" w:hAnsi="Calibri"/>
+                <w:b/>
+                <w:sz w:val="18"/>
+              </w:rPr>
+              <w:t>Paper Examples</w:t>
+            </w:r>
+          </w:p>
+        </w:tc>
+        <w:tc>
+          <w:tcPr>
+            <w:tcW w:type="dxa" w:w="3240"/>
+            <w:shd w:fill="F2F4F7"/>
+            <w:vAlign w:val="center"/>
+          </w:tcPr>
+          <w:p>
+            <w:pPr>
+              <w:spacing w:after="0"/>
+            </w:pPr>
+            <w:r/>
+            <w:r>
+              <w:rPr>
+                <w:rFonts w:ascii="Calibri" w:hAnsi="Calibri"/>
+                <w:b/>
+                <w:sz w:val="18"/>
+              </w:rPr>
+              <w:t>Use</w:t>
+            </w:r>
+          </w:p>
+        </w:tc>
+        <w:tc>
+          <w:tcPr>
+            <w:tcW w:type="dxa" w:w="2160"/>
+            <w:shd w:fill="F2F4F7"/>
+            <w:vAlign w:val="center"/>
+          </w:tcPr>
+          <w:p>
+            <w:pPr>
+              <w:spacing w:after="0"/>
+            </w:pPr>
+            <w:r/>
+            <w:r>
+              <w:rPr>
+                <w:rFonts w:ascii="Calibri" w:hAnsi="Calibri"/>
+                <w:b/>
+                <w:sz w:val="18"/>
+              </w:rPr>
+              <w:t>Caution</w:t>
             </w:r>
           </w:p>
         </w:tc>
@@ -376,7 +600,7 @@
       <w:tr>
         <w:tc>
           <w:tcPr>
-            <w:tcW w:type="dxa" w:w="2232"/>
+            <w:tcW w:type="dxa" w:w="2088"/>
             <w:vAlign w:val="center"/>
           </w:tcPr>
           <w:p>
@@ -396,7 +620,7 @@
         </w:tc>
         <w:tc>
           <w:tcPr>
-            <w:tcW w:type="dxa" w:w="2088"/>
+            <w:tcW w:type="dxa" w:w="1656"/>
             <w:vAlign w:val="center"/>
           </w:tcPr>
           <w:p>
@@ -416,7 +640,7 @@
         </w:tc>
         <w:tc>
           <w:tcPr>
-            <w:tcW w:type="dxa" w:w="4824"/>
+            <w:tcW w:type="dxa" w:w="3240"/>
             <w:vAlign w:val="center"/>
           </w:tcPr>
           <w:p>
@@ -430,7 +654,27 @@
                 <w:b w:val="0"/>
                 <w:sz w:val="18"/>
               </w:rPr>
-              <w:t>Useful if embryology/image data can be accessed.</w:t>
+              <w:t>Useful if embryology variables, embryo grades, images or time-lapse data are available.</w:t>
+            </w:r>
+          </w:p>
+        </w:tc>
+        <w:tc>
+          <w:tcPr>
+            <w:tcW w:type="dxa" w:w="2160"/>
+            <w:vAlign w:val="center"/>
+          </w:tcPr>
+          <w:p>
+            <w:pPr>
+              <w:spacing w:after="0"/>
+            </w:pPr>
+            <w:r/>
+            <w:r>
+              <w:rPr>
+                <w:rFonts w:ascii="Calibri" w:hAnsi="Calibri"/>
+                <w:b w:val="0"/>
+                <w:sz w:val="18"/>
+              </w:rPr>
+              <w:t>Do not promise image/deep-learning work without data access.</w:t>
             </w:r>
           </w:p>
         </w:tc>
@@ -438,7 +682,89 @@
       <w:tr>
         <w:tc>
           <w:tcPr>
-            <w:tcW w:type="dxa" w:w="2232"/>
+            <w:tcW w:type="dxa" w:w="2088"/>
+            <w:vAlign w:val="center"/>
+          </w:tcPr>
+          <w:p>
+            <w:pPr>
+              <w:spacing w:after="0"/>
+            </w:pPr>
+            <w:r/>
+            <w:r>
+              <w:rPr>
+                <w:rFonts w:ascii="Calibri" w:hAnsi="Calibri"/>
+                <w:b w:val="0"/>
+                <w:sz w:val="18"/>
+              </w:rPr>
+              <w:t>Ovarian stimulation / protocol decision support</w:t>
+            </w:r>
+          </w:p>
+        </w:tc>
+        <w:tc>
+          <w:tcPr>
+            <w:tcW w:type="dxa" w:w="1656"/>
+            <w:vAlign w:val="center"/>
+          </w:tcPr>
+          <w:p>
+            <w:pPr>
+              <w:spacing w:after="0"/>
+            </w:pPr>
+            <w:r/>
+            <w:r>
+              <w:rPr>
+                <w:rFonts w:ascii="Calibri" w:hAnsi="Calibri"/>
+                <w:b w:val="0"/>
+                <w:sz w:val="18"/>
+              </w:rPr>
+              <w:t>1, 2, 21, 22, 23</w:t>
+            </w:r>
+          </w:p>
+        </w:tc>
+        <w:tc>
+          <w:tcPr>
+            <w:tcW w:type="dxa" w:w="3240"/>
+            <w:vAlign w:val="center"/>
+          </w:tcPr>
+          <w:p>
+            <w:pPr>
+              <w:spacing w:after="0"/>
+            </w:pPr>
+            <w:r/>
+            <w:r>
+              <w:rPr>
+                <w:rFonts w:ascii="Calibri" w:hAnsi="Calibri"/>
+                <w:b w:val="0"/>
+                <w:sz w:val="18"/>
+              </w:rPr>
+              <w:t>Strong direction if dose, trigger and stimulation-monitoring records are available.</w:t>
+            </w:r>
+          </w:p>
+        </w:tc>
+        <w:tc>
+          <w:tcPr>
+            <w:tcW w:type="dxa" w:w="2160"/>
+            <w:vAlign w:val="center"/>
+          </w:tcPr>
+          <w:p>
+            <w:pPr>
+              <w:spacing w:after="0"/>
+            </w:pPr>
+            <w:r/>
+            <w:r>
+              <w:rPr>
+                <w:rFonts w:ascii="Calibri" w:hAnsi="Calibri"/>
+                <w:b w:val="0"/>
+                <w:sz w:val="18"/>
+              </w:rPr>
+              <w:t>May require more detailed clinical workflow data than basic outcome prediction.</w:t>
+            </w:r>
+          </w:p>
+        </w:tc>
+      </w:tr>
+      <w:tr>
+        <w:tc>
+          <w:tcPr>
+            <w:tcW w:type="dxa" w:w="2088"/>
             <w:vAlign w:val="center"/>
           </w:tcPr>
           <w:p>
@@ -458,7 +784,7 @@
         </w:tc>
         <w:tc>
           <w:tcPr>
-            <w:tcW w:type="dxa" w:w="2088"/>
+            <w:tcW w:type="dxa" w:w="1656"/>
             <w:vAlign w:val="center"/>
           </w:tcPr>
           <w:p>
@@ -478,7 +804,7 @@
         </w:tc>
         <w:tc>
           <w:tcPr>
-            <w:tcW w:type="dxa" w:w="4824"/>
+            <w:tcW w:type="dxa" w:w="3240"/>
             <w:vAlign w:val="center"/>
           </w:tcPr>
           <w:p>
@@ -492,7 +818,109 @@
                 <w:b w:val="0"/>
                 <w:sz w:val="18"/>
               </w:rPr>
-              <w:t>Promising but dataset-dependent.</w:t>
+              <w:t>Potentially important because many models are not validated in Indian IVF settings.</w:t>
+            </w:r>
+          </w:p>
+        </w:tc>
+        <w:tc>
+          <w:tcPr>
+            <w:tcW w:type="dxa" w:w="2160"/>
+            <w:vAlign w:val="center"/>
+          </w:tcPr>
+          <w:p>
+            <w:pPr>
+              <w:spacing w:after="0"/>
+            </w:pPr>
+            <w:r/>
+            <w:r>
+              <w:rPr>
+                <w:rFonts w:ascii="Calibri" w:hAnsi="Calibri"/>
+                <w:b w:val="0"/>
+                <w:sz w:val="18"/>
+              </w:rPr>
+              <w:t>Should appear in title only if Indian clinic data and validation are feasible.</w:t>
+            </w:r>
+          </w:p>
+        </w:tc>
+      </w:tr>
+      <w:tr>
+        <w:tc>
+          <w:tcPr>
+            <w:tcW w:type="dxa" w:w="2088"/>
+            <w:vAlign w:val="center"/>
+          </w:tcPr>
+          <w:p>
+            <w:pPr>
+              <w:spacing w:after="0"/>
+            </w:pPr>
+            <w:r/>
+            <w:r>
+              <w:rPr>
+                <w:rFonts w:ascii="Calibri" w:hAnsi="Calibri"/>
+                <w:b w:val="0"/>
+                <w:sz w:val="18"/>
+              </w:rPr>
+              <w:t>Lifestyle and contextual data</w:t>
+            </w:r>
+          </w:p>
+        </w:tc>
+        <w:tc>
+          <w:tcPr>
+            <w:tcW w:type="dxa" w:w="1656"/>
+            <w:vAlign w:val="center"/>
+          </w:tcPr>
+          <w:p>
+            <w:pPr>
+              <w:spacing w:after="0"/>
+            </w:pPr>
+            <w:r/>
+            <w:r>
+              <w:rPr>
+                <w:rFonts w:ascii="Calibri" w:hAnsi="Calibri"/>
+                <w:b w:val="0"/>
+                <w:sz w:val="18"/>
+              </w:rPr>
+              <w:t>Mainly from planned data framework, not yet a strong repeated paper gap</w:t>
+            </w:r>
+          </w:p>
+        </w:tc>
+        <w:tc>
+          <w:tcPr>
+            <w:tcW w:type="dxa" w:w="3240"/>
+            <w:vAlign w:val="center"/>
+          </w:tcPr>
+          <w:p>
+            <w:pPr>
+              <w:spacing w:after="0"/>
+            </w:pPr>
+            <w:r/>
+            <w:r>
+              <w:rPr>
+                <w:rFonts w:ascii="Calibri" w:hAnsi="Calibri"/>
+                <w:b w:val="0"/>
+                <w:sz w:val="18"/>
+              </w:rPr>
+              <w:t>Can enrich personalization if reliably collected.</w:t>
+            </w:r>
+          </w:p>
+        </w:tc>
+        <w:tc>
+          <w:tcPr>
+            <w:tcW w:type="dxa" w:w="2160"/>
+            <w:vAlign w:val="center"/>
+          </w:tcPr>
+          <w:p>
+            <w:pPr>
+              <w:spacing w:after="0"/>
+            </w:pPr>
+            <w:r/>
+            <w:r>
+              <w:rPr>
+                <w:rFonts w:ascii="Calibri" w:hAnsi="Calibri"/>
+                <w:b w:val="0"/>
+                <w:sz w:val="18"/>
+              </w:rPr>
+              <w:t>Should remain conditional until questionnaire/data feasibility is confirmed.</w:t>
             </w:r>
           </w:p>
         </w:tc>
@@ -504,7 +932,7 @@
         <w:pStyle w:val="Heading1"/>
       </w:pPr>
       <w:r>
-        <w:t>Repeated Gap Frequency</w:t>
+        <w:t>Repeated Gap Assessment</w:t>
       </w:r>
     </w:p>
     <w:tbl>
@@ -515,14 +943,16 @@
         <w:tblLook w:firstColumn="1" w:firstRow="1" w:lastColumn="0" w:lastRow="0" w:noHBand="0" w:noVBand="1" w:val="04A0"/>
       </w:tblPr>
       <w:tblGrid>
-        <w:gridCol w:w="3120"/>
-        <w:gridCol w:w="3120"/>
-        <w:gridCol w:w="3120"/>
+        <w:gridCol w:w="1872"/>
+        <w:gridCol w:w="1872"/>
+        <w:gridCol w:w="1872"/>
+        <w:gridCol w:w="1872"/>
+        <w:gridCol w:w="1872"/>
       </w:tblGrid>
       <w:tr>
         <w:tc>
           <w:tcPr>
-            <w:tcW w:type="dxa" w:w="2880"/>
+            <w:tcW w:type="dxa" w:w="2016"/>
             <w:shd w:fill="F2F4F7"/>
             <w:vAlign w:val="center"/>
           </w:tcPr>
@@ -543,7 +973,7 @@
         </w:tc>
         <w:tc>
           <w:tcPr>
-            <w:tcW w:type="dxa" w:w="1584"/>
+            <w:tcW w:type="dxa" w:w="1008"/>
             <w:shd w:fill="F2F4F7"/>
             <w:vAlign w:val="center"/>
           </w:tcPr>
@@ -564,7 +994,7 @@
         </w:tc>
         <w:tc>
           <w:tcPr>
-            <w:tcW w:type="dxa" w:w="4608"/>
+            <w:tcW w:type="dxa" w:w="1512"/>
             <w:shd w:fill="F2F4F7"/>
             <w:vAlign w:val="center"/>
           </w:tcPr>
@@ -579,7 +1009,49 @@
                 <w:b/>
                 <w:sz w:val="18"/>
               </w:rPr>
-              <w:t>How To Use It</w:t>
+              <w:t>Evidence Strength</w:t>
+            </w:r>
+          </w:p>
+        </w:tc>
+        <w:tc>
+          <w:tcPr>
+            <w:tcW w:type="dxa" w:w="1440"/>
+            <w:shd w:fill="F2F4F7"/>
+            <w:vAlign w:val="center"/>
+          </w:tcPr>
+          <w:p>
+            <w:pPr>
+              <w:spacing w:after="0"/>
+            </w:pPr>
+            <w:r/>
+            <w:r>
+              <w:rPr>
+                <w:rFonts w:ascii="Calibri" w:hAnsi="Calibri"/>
+                <w:b/>
+                <w:sz w:val="18"/>
+              </w:rPr>
+              <w:t>Actionable in PhD?</w:t>
+            </w:r>
+          </w:p>
+        </w:tc>
+        <w:tc>
+          <w:tcPr>
+            <w:tcW w:type="dxa" w:w="3168"/>
+            <w:shd w:fill="F2F4F7"/>
+            <w:vAlign w:val="center"/>
+          </w:tcPr>
+          <w:p>
+            <w:pPr>
+              <w:spacing w:after="0"/>
+            </w:pPr>
+            <w:r/>
+            <w:r>
+              <w:rPr>
+                <w:rFonts w:ascii="Calibri" w:hAnsi="Calibri"/>
+                <w:b/>
+                <w:sz w:val="18"/>
+              </w:rPr>
+              <w:t>Topic Relevance</w:t>
             </w:r>
           </w:p>
         </w:tc>
@@ -587,7 +1059,7 @@
       <w:tr>
         <w:tc>
           <w:tcPr>
-            <w:tcW w:type="dxa" w:w="2880"/>
+            <w:tcW w:type="dxa" w:w="2016"/>
             <w:vAlign w:val="center"/>
           </w:tcPr>
           <w:p>
@@ -607,7 +1079,7 @@
         </w:tc>
         <w:tc>
           <w:tcPr>
-            <w:tcW w:type="dxa" w:w="1584"/>
+            <w:tcW w:type="dxa" w:w="1008"/>
             <w:vAlign w:val="center"/>
           </w:tcPr>
           <w:p>
@@ -621,13 +1093,13 @@
                 <w:b w:val="0"/>
                 <w:sz w:val="18"/>
               </w:rPr>
-              <w:t>26 papers</w:t>
+              <w:t>26</w:t>
             </w:r>
           </w:p>
         </w:tc>
         <w:tc>
           <w:tcPr>
-            <w:tcW w:type="dxa" w:w="4608"/>
+            <w:tcW w:type="dxa" w:w="1512"/>
             <w:vAlign w:val="center"/>
           </w:tcPr>
           <w:p>
@@ -641,7 +1113,47 @@
                 <w:b w:val="0"/>
                 <w:sz w:val="18"/>
               </w:rPr>
-              <w:t>Strong repeated gap; final claim depends on access to independent clinic/time-period data.</w:t>
+              <w:t>Very strong</w:t>
+            </w:r>
+          </w:p>
+        </w:tc>
+        <w:tc>
+          <w:tcPr>
+            <w:tcW w:type="dxa" w:w="1440"/>
+            <w:vAlign w:val="center"/>
+          </w:tcPr>
+          <w:p>
+            <w:pPr>
+              <w:spacing w:after="0"/>
+            </w:pPr>
+            <w:r/>
+            <w:r>
+              <w:rPr>
+                <w:rFonts w:ascii="Calibri" w:hAnsi="Calibri"/>
+                <w:b w:val="0"/>
+                <w:sz w:val="18"/>
+              </w:rPr>
+              <w:t>Conditional</w:t>
+            </w:r>
+          </w:p>
+        </w:tc>
+        <w:tc>
+          <w:tcPr>
+            <w:tcW w:type="dxa" w:w="3168"/>
+            <w:vAlign w:val="center"/>
+          </w:tcPr>
+          <w:p>
+            <w:pPr>
+              <w:spacing w:after="0"/>
+            </w:pPr>
+            <w:r/>
+            <w:r>
+              <w:rPr>
+                <w:rFonts w:ascii="Calibri" w:hAnsi="Calibri"/>
+                <w:b w:val="0"/>
+                <w:sz w:val="18"/>
+              </w:rPr>
+              <w:t>Strong if independent clinic, source or time-period data is available.</w:t>
             </w:r>
           </w:p>
         </w:tc>
@@ -649,7 +1161,7 @@
       <w:tr>
         <w:tc>
           <w:tcPr>
-            <w:tcW w:type="dxa" w:w="2880"/>
+            <w:tcW w:type="dxa" w:w="2016"/>
             <w:vAlign w:val="center"/>
           </w:tcPr>
           <w:p>
@@ -669,7 +1181,7 @@
         </w:tc>
         <w:tc>
           <w:tcPr>
-            <w:tcW w:type="dxa" w:w="1584"/>
+            <w:tcW w:type="dxa" w:w="1008"/>
             <w:vAlign w:val="center"/>
           </w:tcPr>
           <w:p>
@@ -683,13 +1195,13 @@
                 <w:b w:val="0"/>
                 <w:sz w:val="18"/>
               </w:rPr>
-              <w:t>18 papers</w:t>
+              <w:t>18</w:t>
             </w:r>
           </w:p>
         </w:tc>
         <w:tc>
           <w:tcPr>
-            <w:tcW w:type="dxa" w:w="4608"/>
+            <w:tcW w:type="dxa" w:w="1512"/>
             <w:vAlign w:val="center"/>
           </w:tcPr>
           <w:p>
@@ -703,7 +1215,47 @@
                 <w:b w:val="0"/>
                 <w:sz w:val="18"/>
               </w:rPr>
-              <w:t>Strong design opportunity; supports CDSS framing.</w:t>
+              <w:t>Very strong</w:t>
+            </w:r>
+          </w:p>
+        </w:tc>
+        <w:tc>
+          <w:tcPr>
+            <w:tcW w:type="dxa" w:w="1440"/>
+            <w:vAlign w:val="center"/>
+          </w:tcPr>
+          <w:p>
+            <w:pPr>
+              <w:spacing w:after="0"/>
+            </w:pPr>
+            <w:r/>
+            <w:r>
+              <w:rPr>
+                <w:rFonts w:ascii="Calibri" w:hAnsi="Calibri"/>
+                <w:b w:val="0"/>
+                <w:sz w:val="18"/>
+              </w:rPr>
+              <w:t>Yes</w:t>
+            </w:r>
+          </w:p>
+        </w:tc>
+        <w:tc>
+          <w:tcPr>
+            <w:tcW w:type="dxa" w:w="3168"/>
+            <w:vAlign w:val="center"/>
+          </w:tcPr>
+          <w:p>
+            <w:pPr>
+              <w:spacing w:after="0"/>
+            </w:pPr>
+            <w:r/>
+            <w:r>
+              <w:rPr>
+                <w:rFonts w:ascii="Calibri" w:hAnsi="Calibri"/>
+                <w:b w:val="0"/>
+                <w:sz w:val="18"/>
+              </w:rPr>
+              <w:t>Supports CDSS framing and avoids an accuracy-only thesis.</w:t>
             </w:r>
           </w:p>
         </w:tc>
@@ -711,7 +1263,7 @@
       <w:tr>
         <w:tc>
           <w:tcPr>
-            <w:tcW w:type="dxa" w:w="2880"/>
+            <w:tcW w:type="dxa" w:w="2016"/>
             <w:vAlign w:val="center"/>
           </w:tcPr>
           <w:p>
@@ -731,7 +1283,7 @@
         </w:tc>
         <w:tc>
           <w:tcPr>
-            <w:tcW w:type="dxa" w:w="1584"/>
+            <w:tcW w:type="dxa" w:w="1008"/>
             <w:vAlign w:val="center"/>
           </w:tcPr>
           <w:p>
@@ -745,13 +1297,13 @@
                 <w:b w:val="0"/>
                 <w:sz w:val="18"/>
               </w:rPr>
-              <w:t>9 papers</w:t>
+              <w:t>9</w:t>
             </w:r>
           </w:p>
         </w:tc>
         <w:tc>
           <w:tcPr>
-            <w:tcW w:type="dxa" w:w="4608"/>
+            <w:tcW w:type="dxa" w:w="1512"/>
             <w:vAlign w:val="center"/>
           </w:tcPr>
           <w:p>
@@ -765,7 +1317,47 @@
                 <w:b w:val="0"/>
                 <w:sz w:val="18"/>
               </w:rPr>
-              <w:t>Useful for justification, but full deployment may be beyond PhD scope.</w:t>
+              <w:t>Strong</w:t>
+            </w:r>
+          </w:p>
+        </w:tc>
+        <w:tc>
+          <w:tcPr>
+            <w:tcW w:type="dxa" w:w="1440"/>
+            <w:vAlign w:val="center"/>
+          </w:tcPr>
+          <w:p>
+            <w:pPr>
+              <w:spacing w:after="0"/>
+            </w:pPr>
+            <w:r/>
+            <w:r>
+              <w:rPr>
+                <w:rFonts w:ascii="Calibri" w:hAnsi="Calibri"/>
+                <w:b w:val="0"/>
+                <w:sz w:val="18"/>
+              </w:rPr>
+              <w:t>Partly</w:t>
+            </w:r>
+          </w:p>
+        </w:tc>
+        <w:tc>
+          <w:tcPr>
+            <w:tcW w:type="dxa" w:w="3168"/>
+            <w:vAlign w:val="center"/>
+          </w:tcPr>
+          <w:p>
+            <w:pPr>
+              <w:spacing w:after="0"/>
+            </w:pPr>
+            <w:r/>
+            <w:r>
+              <w:rPr>
+                <w:rFonts w:ascii="Calibri" w:hAnsi="Calibri"/>
+                <w:b w:val="0"/>
+                <w:sz w:val="18"/>
+              </w:rPr>
+              <w:t>Useful for justification; full deployment may be future work.</w:t>
             </w:r>
           </w:p>
         </w:tc>
@@ -773,7 +1365,7 @@
       <w:tr>
         <w:tc>
           <w:tcPr>
-            <w:tcW w:type="dxa" w:w="2880"/>
+            <w:tcW w:type="dxa" w:w="2016"/>
             <w:vAlign w:val="center"/>
           </w:tcPr>
           <w:p>
@@ -793,7 +1385,7 @@
         </w:tc>
         <w:tc>
           <w:tcPr>
-            <w:tcW w:type="dxa" w:w="1584"/>
+            <w:tcW w:type="dxa" w:w="1008"/>
             <w:vAlign w:val="center"/>
           </w:tcPr>
           <w:p>
@@ -807,13 +1399,13 @@
                 <w:b w:val="0"/>
                 <w:sz w:val="18"/>
               </w:rPr>
-              <w:t>9 papers</w:t>
+              <w:t>9</w:t>
             </w:r>
           </w:p>
         </w:tc>
         <w:tc>
           <w:tcPr>
-            <w:tcW w:type="dxa" w:w="4608"/>
+            <w:tcW w:type="dxa" w:w="1512"/>
             <w:vAlign w:val="center"/>
           </w:tcPr>
           <w:p>
@@ -827,7 +1419,47 @@
                 <w:b w:val="0"/>
                 <w:sz w:val="18"/>
               </w:rPr>
-              <w:t>Shows limitation of many studies; can be addressed partly through validation strategy.</w:t>
+              <w:t>Strong</w:t>
+            </w:r>
+          </w:p>
+        </w:tc>
+        <w:tc>
+          <w:tcPr>
+            <w:tcW w:type="dxa" w:w="1440"/>
+            <w:vAlign w:val="center"/>
+          </w:tcPr>
+          <w:p>
+            <w:pPr>
+              <w:spacing w:after="0"/>
+            </w:pPr>
+            <w:r/>
+            <w:r>
+              <w:rPr>
+                <w:rFonts w:ascii="Calibri" w:hAnsi="Calibri"/>
+                <w:b w:val="0"/>
+                <w:sz w:val="18"/>
+              </w:rPr>
+              <w:t>Partly</w:t>
+            </w:r>
+          </w:p>
+        </w:tc>
+        <w:tc>
+          <w:tcPr>
+            <w:tcW w:type="dxa" w:w="3168"/>
+            <w:vAlign w:val="center"/>
+          </w:tcPr>
+          <w:p>
+            <w:pPr>
+              <w:spacing w:after="0"/>
+            </w:pPr>
+            <w:r/>
+            <w:r>
+              <w:rPr>
+                <w:rFonts w:ascii="Calibri" w:hAnsi="Calibri"/>
+                <w:b w:val="0"/>
+                <w:sz w:val="18"/>
+              </w:rPr>
+              <w:t>Can be handled through careful validation and honest limitation wording.</w:t>
             </w:r>
           </w:p>
         </w:tc>
@@ -835,7 +1467,7 @@
       <w:tr>
         <w:tc>
           <w:tcPr>
-            <w:tcW w:type="dxa" w:w="2880"/>
+            <w:tcW w:type="dxa" w:w="2016"/>
             <w:vAlign w:val="center"/>
           </w:tcPr>
           <w:p>
@@ -855,7 +1487,7 @@
         </w:tc>
         <w:tc>
           <w:tcPr>
-            <w:tcW w:type="dxa" w:w="1584"/>
+            <w:tcW w:type="dxa" w:w="1008"/>
             <w:vAlign w:val="center"/>
           </w:tcPr>
           <w:p>
@@ -869,13 +1501,13 @@
                 <w:b w:val="0"/>
                 <w:sz w:val="18"/>
               </w:rPr>
-              <w:t>8 papers</w:t>
+              <w:t>8</w:t>
             </w:r>
           </w:p>
         </w:tc>
         <w:tc>
           <w:tcPr>
-            <w:tcW w:type="dxa" w:w="4608"/>
+            <w:tcW w:type="dxa" w:w="1512"/>
             <w:vAlign w:val="center"/>
           </w:tcPr>
           <w:p>
@@ -889,7 +1521,47 @@
                 <w:b w:val="0"/>
                 <w:sz w:val="18"/>
               </w:rPr>
-              <w:t>Supports XAI, clinician review and cautious claims.</w:t>
+              <w:t>Strong</w:t>
+            </w:r>
+          </w:p>
+        </w:tc>
+        <w:tc>
+          <w:tcPr>
+            <w:tcW w:type="dxa" w:w="1440"/>
+            <w:vAlign w:val="center"/>
+          </w:tcPr>
+          <w:p>
+            <w:pPr>
+              <w:spacing w:after="0"/>
+            </w:pPr>
+            <w:r/>
+            <w:r>
+              <w:rPr>
+                <w:rFonts w:ascii="Calibri" w:hAnsi="Calibri"/>
+                <w:b w:val="0"/>
+                <w:sz w:val="18"/>
+              </w:rPr>
+              <w:t>Yes</w:t>
+            </w:r>
+          </w:p>
+        </w:tc>
+        <w:tc>
+          <w:tcPr>
+            <w:tcW w:type="dxa" w:w="3168"/>
+            <w:vAlign w:val="center"/>
+          </w:tcPr>
+          <w:p>
+            <w:pPr>
+              <w:spacing w:after="0"/>
+            </w:pPr>
+            <w:r/>
+            <w:r>
+              <w:rPr>
+                <w:rFonts w:ascii="Calibri" w:hAnsi="Calibri"/>
+                <w:b w:val="0"/>
+                <w:sz w:val="18"/>
+              </w:rPr>
+              <w:t>Supports XAI, clinician review and conservative claims.</w:t>
             </w:r>
           </w:p>
         </w:tc>
@@ -897,7 +1569,7 @@
       <w:tr>
         <w:tc>
           <w:tcPr>
-            <w:tcW w:type="dxa" w:w="2880"/>
+            <w:tcW w:type="dxa" w:w="2016"/>
             <w:vAlign w:val="center"/>
           </w:tcPr>
           <w:p>
@@ -917,7 +1589,7 @@
         </w:tc>
         <w:tc>
           <w:tcPr>
-            <w:tcW w:type="dxa" w:w="1584"/>
+            <w:tcW w:type="dxa" w:w="1008"/>
             <w:vAlign w:val="center"/>
           </w:tcPr>
           <w:p>
@@ -931,13 +1603,53 @@
                 <w:b w:val="0"/>
                 <w:sz w:val="18"/>
               </w:rPr>
-              <w:t>6 papers</w:t>
+              <w:t>6</w:t>
             </w:r>
           </w:p>
         </w:tc>
         <w:tc>
           <w:tcPr>
-            <w:tcW w:type="dxa" w:w="4608"/>
+            <w:tcW w:type="dxa" w:w="1512"/>
+            <w:vAlign w:val="center"/>
+          </w:tcPr>
+          <w:p>
+            <w:pPr>
+              <w:spacing w:after="0"/>
+            </w:pPr>
+            <w:r/>
+            <w:r>
+              <w:rPr>
+                <w:rFonts w:ascii="Calibri" w:hAnsi="Calibri"/>
+                <w:b w:val="0"/>
+                <w:sz w:val="18"/>
+              </w:rPr>
+              <w:t>Moderate-strong</w:t>
+            </w:r>
+          </w:p>
+        </w:tc>
+        <w:tc>
+          <w:tcPr>
+            <w:tcW w:type="dxa" w:w="1440"/>
+            <w:vAlign w:val="center"/>
+          </w:tcPr>
+          <w:p>
+            <w:pPr>
+              <w:spacing w:after="0"/>
+            </w:pPr>
+            <w:r/>
+            <w:r>
+              <w:rPr>
+                <w:rFonts w:ascii="Calibri" w:hAnsi="Calibri"/>
+                <w:b w:val="0"/>
+                <w:sz w:val="18"/>
+              </w:rPr>
+              <w:t>Conditional</w:t>
+            </w:r>
+          </w:p>
+        </w:tc>
+        <w:tc>
+          <w:tcPr>
+            <w:tcW w:type="dxa" w:w="3168"/>
             <w:vAlign w:val="center"/>
           </w:tcPr>
           <w:p>
@@ -952,6 +1664,279 @@
                 <w:sz w:val="18"/>
               </w:rPr>
               <w:t>Supports multi-center or temporal validation if feasible.</w:t>
+            </w:r>
+          </w:p>
+        </w:tc>
+      </w:tr>
+    </w:tbl>
+    <w:p/>
+    <w:p>
+      <w:pPr>
+        <w:pStyle w:val="Heading1"/>
+      </w:pPr>
+      <w:r>
+        <w:t>Strong Gaps Versus Conditional Gaps</w:t>
+      </w:r>
+    </w:p>
+    <w:tbl>
+      <w:tblPr>
+        <w:tblStyle w:val="TableGrid"/>
+        <w:tblW w:type="auto" w:w="0"/>
+        <w:jc w:val="center"/>
+        <w:tblLook w:firstColumn="1" w:firstRow="1" w:lastColumn="0" w:lastRow="0" w:noHBand="0" w:noVBand="1" w:val="04A0"/>
+      </w:tblPr>
+      <w:tblGrid>
+        <w:gridCol w:w="3120"/>
+        <w:gridCol w:w="3120"/>
+        <w:gridCol w:w="3120"/>
+      </w:tblGrid>
+      <w:tr>
+        <w:tc>
+          <w:tcPr>
+            <w:tcW w:type="dxa" w:w="1944"/>
+            <w:shd w:fill="F2F4F7"/>
+            <w:vAlign w:val="center"/>
+          </w:tcPr>
+          <w:p>
+            <w:pPr>
+              <w:spacing w:after="0"/>
+            </w:pPr>
+            <w:r/>
+            <w:r>
+              <w:rPr>
+                <w:rFonts w:ascii="Calibri" w:hAnsi="Calibri"/>
+                <w:b/>
+                <w:sz w:val="18"/>
+              </w:rPr>
+              <w:t>Gap Type</w:t>
+            </w:r>
+          </w:p>
+        </w:tc>
+        <w:tc>
+          <w:tcPr>
+            <w:tcW w:type="dxa" w:w="3744"/>
+            <w:shd w:fill="F2F4F7"/>
+            <w:vAlign w:val="center"/>
+          </w:tcPr>
+          <w:p>
+            <w:pPr>
+              <w:spacing w:after="0"/>
+            </w:pPr>
+            <w:r/>
+            <w:r>
+              <w:rPr>
+                <w:rFonts w:ascii="Calibri" w:hAnsi="Calibri"/>
+                <w:b/>
+                <w:sz w:val="18"/>
+              </w:rPr>
+              <w:t>Gaps</w:t>
+            </w:r>
+          </w:p>
+        </w:tc>
+        <w:tc>
+          <w:tcPr>
+            <w:tcW w:type="dxa" w:w="3456"/>
+            <w:shd w:fill="F2F4F7"/>
+            <w:vAlign w:val="center"/>
+          </w:tcPr>
+          <w:p>
+            <w:pPr>
+              <w:spacing w:after="0"/>
+            </w:pPr>
+            <w:r/>
+            <w:r>
+              <w:rPr>
+                <w:rFonts w:ascii="Calibri" w:hAnsi="Calibri"/>
+                <w:b/>
+                <w:sz w:val="18"/>
+              </w:rPr>
+              <w:t>How To Treat In Proposal</w:t>
+            </w:r>
+          </w:p>
+        </w:tc>
+      </w:tr>
+      <w:tr>
+        <w:tc>
+          <w:tcPr>
+            <w:tcW w:type="dxa" w:w="1944"/>
+            <w:vAlign w:val="center"/>
+          </w:tcPr>
+          <w:p>
+            <w:pPr>
+              <w:spacing w:after="0"/>
+            </w:pPr>
+            <w:r/>
+            <w:r>
+              <w:rPr>
+                <w:rFonts w:ascii="Calibri" w:hAnsi="Calibri"/>
+                <w:b w:val="0"/>
+                <w:sz w:val="18"/>
+              </w:rPr>
+              <w:t>Strong repeated gaps</w:t>
+            </w:r>
+          </w:p>
+        </w:tc>
+        <w:tc>
+          <w:tcPr>
+            <w:tcW w:type="dxa" w:w="3744"/>
+            <w:vAlign w:val="center"/>
+          </w:tcPr>
+          <w:p>
+            <w:pPr>
+              <w:spacing w:after="0"/>
+            </w:pPr>
+            <w:r/>
+            <w:r>
+              <w:rPr>
+                <w:rFonts w:ascii="Calibri" w:hAnsi="Calibri"/>
+                <w:b w:val="0"/>
+                <w:sz w:val="18"/>
+              </w:rPr>
+              <w:t>External validation, clinical decision support, trustworthy/explainable AI, real-world clinical usefulness, retrospective/single-center limitations.</w:t>
+            </w:r>
+          </w:p>
+        </w:tc>
+        <w:tc>
+          <w:tcPr>
+            <w:tcW w:type="dxa" w:w="3456"/>
+            <w:vAlign w:val="center"/>
+          </w:tcPr>
+          <w:p>
+            <w:pPr>
+              <w:spacing w:after="0"/>
+            </w:pPr>
+            <w:r/>
+            <w:r>
+              <w:rPr>
+                <w:rFonts w:ascii="Calibri" w:hAnsi="Calibri"/>
+                <w:b w:val="0"/>
+                <w:sz w:val="18"/>
+              </w:rPr>
+              <w:t>Use these to justify the main research direction.</w:t>
+            </w:r>
+          </w:p>
+        </w:tc>
+      </w:tr>
+      <w:tr>
+        <w:tc>
+          <w:tcPr>
+            <w:tcW w:type="dxa" w:w="1944"/>
+            <w:vAlign w:val="center"/>
+          </w:tcPr>
+          <w:p>
+            <w:pPr>
+              <w:spacing w:after="0"/>
+            </w:pPr>
+            <w:r/>
+            <w:r>
+              <w:rPr>
+                <w:rFonts w:ascii="Calibri" w:hAnsi="Calibri"/>
+                <w:b w:val="0"/>
+                <w:sz w:val="18"/>
+              </w:rPr>
+              <w:t>Conditional gaps</w:t>
+            </w:r>
+          </w:p>
+        </w:tc>
+        <w:tc>
+          <w:tcPr>
+            <w:tcW w:type="dxa" w:w="3744"/>
+            <w:vAlign w:val="center"/>
+          </w:tcPr>
+          <w:p>
+            <w:pPr>
+              <w:spacing w:after="0"/>
+            </w:pPr>
+            <w:r/>
+            <w:r>
+              <w:rPr>
+                <w:rFonts w:ascii="Calibri" w:hAnsi="Calibri"/>
+                <w:b w:val="0"/>
+                <w:sz w:val="18"/>
+              </w:rPr>
+              <w:t>Indian validation, lifestyle data, embryo-image/deep-learning work, multi-center validation.</w:t>
+            </w:r>
+          </w:p>
+        </w:tc>
+        <w:tc>
+          <w:tcPr>
+            <w:tcW w:type="dxa" w:w="3456"/>
+            <w:vAlign w:val="center"/>
+          </w:tcPr>
+          <w:p>
+            <w:pPr>
+              <w:spacing w:after="0"/>
+            </w:pPr>
+            <w:r/>
+            <w:r>
+              <w:rPr>
+                <w:rFonts w:ascii="Calibri" w:hAnsi="Calibri"/>
+                <w:b w:val="0"/>
+                <w:sz w:val="18"/>
+              </w:rPr>
+              <w:t>Use only if data access supports them.</w:t>
+            </w:r>
+          </w:p>
+        </w:tc>
+      </w:tr>
+      <w:tr>
+        <w:tc>
+          <w:tcPr>
+            <w:tcW w:type="dxa" w:w="1944"/>
+            <w:vAlign w:val="center"/>
+          </w:tcPr>
+          <w:p>
+            <w:pPr>
+              <w:spacing w:after="0"/>
+            </w:pPr>
+            <w:r/>
+            <w:r>
+              <w:rPr>
+                <w:rFonts w:ascii="Calibri" w:hAnsi="Calibri"/>
+                <w:b w:val="0"/>
+                <w:sz w:val="18"/>
+              </w:rPr>
+              <w:t>Weak/not-yet-claimable gaps</w:t>
+            </w:r>
+          </w:p>
+        </w:tc>
+        <w:tc>
+          <w:tcPr>
+            <w:tcW w:type="dxa" w:w="3744"/>
+            <w:vAlign w:val="center"/>
+          </w:tcPr>
+          <w:p>
+            <w:pPr>
+              <w:spacing w:after="0"/>
+            </w:pPr>
+            <w:r/>
+            <w:r>
+              <w:rPr>
+                <w:rFonts w:ascii="Calibri" w:hAnsi="Calibri"/>
+                <w:b w:val="0"/>
+                <w:sz w:val="18"/>
+              </w:rPr>
+              <w:t>Any gap supported by only one paper or by our interest alone.</w:t>
+            </w:r>
+          </w:p>
+        </w:tc>
+        <w:tc>
+          <w:tcPr>
+            <w:tcW w:type="dxa" w:w="3456"/>
+            <w:vAlign w:val="center"/>
+          </w:tcPr>
+          <w:p>
+            <w:pPr>
+              <w:spacing w:after="0"/>
+            </w:pPr>
+            <w:r/>
+            <w:r>
+              <w:rPr>
+                <w:rFonts w:ascii="Calibri" w:hAnsi="Calibri"/>
+                <w:b w:val="0"/>
+                <w:sz w:val="18"/>
+              </w:rPr>
+              <w:t>Do not use as novelty claim until stronger evidence is collected.</w:t>
             </w:r>
           </w:p>
         </w:tc>
@@ -1000,7 +1985,95 @@
     </w:p>
     <w:p>
       <w:r>
-        <w:t>A defensible opportunity is an explainable clinical decision-support framework for IVF outcome prediction, using available clinical and embryological variables, with validation and clinician review as far as data access permits.</w:t>
+        <w:t>The strongest current research opportunity is not simply to build another IVF prediction model. A more defensible PhD direction is to design an explainable, personalized and clinically usable decision-support framework for IVF outcome prediction, with the exact data modality and validation strategy finalized after clinic data feasibility is known.</w:t>
+      </w:r>
+    </w:p>
+    <w:p>
+      <w:pPr>
+        <w:pStyle w:val="Heading1"/>
+      </w:pPr>
+      <w:r>
+        <w:t>What Should Not Be Claimed Yet</w:t>
+      </w:r>
+    </w:p>
+    <w:p>
+      <w:pPr>
+        <w:pStyle w:val="ListBullet"/>
+      </w:pPr>
+      <w:r>
+        <w:t>Do not claim that AI will improve IVF success rates unless a clinical outcome study proves it.</w:t>
+      </w:r>
+    </w:p>
+    <w:p>
+      <w:pPr>
+        <w:pStyle w:val="ListBullet"/>
+      </w:pPr>
+      <w:r>
+        <w:t>Do not claim external validation unless an independent source, clinic or time period is used.</w:t>
+      </w:r>
+    </w:p>
+    <w:p>
+      <w:pPr>
+        <w:pStyle w:val="ListBullet"/>
+      </w:pPr>
+      <w:r>
+        <w:t>Do not include Indian women, lifestyle data or embryo images in the final title unless those data are confirmed.</w:t>
+      </w:r>
+    </w:p>
+    <w:p>
+      <w:pPr>
+        <w:pStyle w:val="ListBullet"/>
+      </w:pPr>
+      <w:r>
+        <w:t>Do not present model accuracy as the only PhD contribution; explanation, validation and clinical usability matter.</w:t>
+      </w:r>
+    </w:p>
+    <w:p>
+      <w:pPr>
+        <w:pStyle w:val="Heading1"/>
+      </w:pPr>
+      <w:r>
+        <w:t>Guide Discussion Questions</w:t>
+      </w:r>
+    </w:p>
+    <w:p>
+      <w:pPr>
+        <w:pStyle w:val="ListNumber"/>
+      </w:pPr>
+      <w:r>
+        <w:t>Which theme should be prioritized: outcome prediction, stimulation decision support or broader clinical decision support?</w:t>
+      </w:r>
+    </w:p>
+    <w:p>
+      <w:pPr>
+        <w:pStyle w:val="ListNumber"/>
+      </w:pPr>
+      <w:r>
+        <w:t>Should the topic remain broad until data access is confirmed, or should it be narrowed now?</w:t>
+      </w:r>
+    </w:p>
+    <w:p>
+      <w:pPr>
+        <w:pStyle w:val="ListNumber"/>
+      </w:pPr>
+      <w:r>
+        <w:t>Should Indian validation be part of the title, or only a conditional objective?</w:t>
+      </w:r>
+    </w:p>
+    <w:p>
+      <w:pPr>
+        <w:pStyle w:val="ListNumber"/>
+      </w:pPr>
+      <w:r>
+        <w:t>Which gaps are strong enough for the proposal, and which should remain future work?</w:t>
+      </w:r>
+    </w:p>
+    <w:p>
+      <w:pPr>
+        <w:pStyle w:val="ListNumber"/>
+      </w:pPr>
+      <w:r>
+        <w:t>What dataset scenario is realistic for the next meeting with doctors or clinics?</w:t>
       </w:r>
     </w:p>
     <w:sectPr>

</xml_diff>